<commit_message>
Consolidate thesis validation and physical measurements
</commit_message>
<xml_diff>
--- a/sources/manuscript/annexes/adaptacao_parametrica_modelos/anexo_c_adaptacao_parametrica_modelos.docx
+++ b/sources/manuscript/annexes/adaptacao_parametrica_modelos/anexo_c_adaptacao_parametrica_modelos.docx
@@ -3176,7 +3176,7 @@
         <w:pStyle w:val="Heading3"/>
       </w:pPr>
       <w:r>
-        <w:t>C.6.2 Escala global e piso dimensional</w:t>
+        <w:t>C.6.2 Escala global e limite dimensional mínimo</w:t>
       </w:r>
     </w:p>
     <w:p>
@@ -3237,7 +3237,7 @@
         <w:t>HandPerc_override</w:t>
       </w:r>
       <w:r>
-        <w:t xml:space="preserve"> aceita zero como instrução para derivar a escala; valores positivos ficam sujeitos ao mesmo piso de 100% e tecto de 160%. Um perfil com palma inferior a 82 mm produz o tamanho mínimo do modelo, não a medida pedida. A configuração deve ser rejeitada ou acompanhada por um aviso de cobertura, em vez de ser descrita como adaptação individual.</w:t>
+        <w:t xml:space="preserve"> aceita zero como instrução para derivar a escala; valores positivos ficam sujeitos ao mesmo limite mínimo de 100% e ao limite máximo de 160%. Um perfil com palma inferior a 82 mm produz o tamanho mínimo do modelo, não a medida pedida. A configuração deve ser rejeitada ou acompanhada por um aviso de cobertura, em vez de ser descrita como adaptação individual.</w:t>
       </w:r>
     </w:p>
     <w:p>
@@ -3841,7 +3841,7 @@
     <w:p>
       <w:pPr/>
       <w:r>
-        <w:t>Uma configuração pode avançar para geração quando os campos necessários existem, os valores são numéricos positivos e permanecem dentro dos intervalos declarados. Deve ser marcada como limitada quando uma entrada é reduzida ao piso do modelo, quando um campo é apenas contextual ou quando a transformação não produz uma correspondência directa entre valor e dimensão final.</w:t>
+        <w:t>Uma configuração pode avançar para geração quando os campos necessários existem, os valores são numéricos positivos e permanecem dentro dos intervalos declarados. Deve ser marcada como limitada quando uma entrada é fixada no limite mínimo do modelo, quando um campo é apenas contextual ou quando a transformação não produz uma correspondência directa entre valor e dimensão final.</w:t>
       </w:r>
     </w:p>
     <w:p>

</xml_diff>